<commit_message>
feat(templates): the signing agreement has a signature field for the employer and one for the employee, content controls the signed copy turns into its signatures
</commit_message>
<xml_diff>
--- a/packages/document-engine/templates/act_aditional_semnare_electronica.docx
+++ b/packages/document-engine/templates/act_aditional_semnare_electronica.docx
@@ -384,7 +384,117 @@
               <w:pStyle w:val="TableContents"/>
               <w:keepNext w:val="false"/>
               <w:bidi w:val="0"/>
-              <w:spacing w:before="680" w:after="0"/>
+              <w:spacing w:before="0" w:after="0"/>
+              <w:ind w:hanging="0" w:left="0"/>
+              <w:jc w:val="center"/>
+              <w:rPr>
+                <w:rFonts w:ascii="Arial" w:hAnsi="Arial" w:eastAsia="Arial" w:cs="Arial"/>
+                <w:b w:val="false"/>
+                <w:i w:val="false"/>
+                <w:color w:val="auto"/>
+                <w:sz w:val="20"/>
+                <w:lang w:val="ro-RO"/>
+              </w:rPr>
+            </w:pPr>
+            <w:sdt>
+              <w:sdtPr>
+                <w:rPr>
+                  <w:rFonts w:eastAsia="Arial" w:cs="Arial" w:ascii="Arial" w:hAnsi="Arial"/>
+                  <w:b w:val="false"/>
+                  <w:i w:val="false"/>
+                  <w:color w:val="auto"/>
+                  <w:spacing w:val="0"/>
+                  <w:w w:val="100"/>
+                  <w:sz w:val="16"/>
+                  <w:szCs w:val="16"/>
+                  <w:lang w:val="ro-RO"/>
+                </w:rPr>
+                <w:alias w:val="sig_employer"/>
+                <w:tag w:val="sig_employer"/>
+                <w:id w:val="1"/>
+                <w:showingPlcHdr/>
+                <w:text w:multiLine="1"/>
+              </w:sdtPr>
+              <w:sdtContent>
+                <w:r>
+                  <w:rPr>
+                    <w:rFonts w:eastAsia="Arial" w:cs="Arial" w:ascii="Arial" w:hAnsi="Arial"/>
+                    <w:b w:val="false"/>
+                    <w:i w:val="false"/>
+                    <w:color w:val="auto"/>
+                    <w:spacing w:val="0"/>
+                    <w:w w:val="100"/>
+                    <w:sz w:val="16"/>
+                    <w:szCs w:val="16"/>
+                    <w:lang w:val="ro-RO"/>
+                  </w:rPr>
+                  <w:t xml:space="preserve">                                                        </w:t>
+                </w:r>
+                <w:r>
+                  <w:rPr>
+                    <w:rFonts w:eastAsia="Arial" w:cs="Arial" w:ascii="Arial" w:hAnsi="Arial"/>
+                    <w:b w:val="false"/>
+                    <w:i w:val="false"/>
+                    <w:color w:val="auto"/>
+                    <w:spacing w:val="0"/>
+                    <w:w w:val="100"/>
+                    <w:sz w:val="16"/>
+                    <w:szCs w:val="16"/>
+                    <w:lang w:val="ro-RO"/>
+                  </w:rPr>
+                  <w:br/>
+                </w:r>
+                <w:r>
+                  <w:rPr>
+                    <w:rFonts w:eastAsia="Arial" w:cs="Arial" w:ascii="Arial" w:hAnsi="Arial"/>
+                    <w:b w:val="false"/>
+                    <w:i w:val="false"/>
+                    <w:color w:val="auto"/>
+                    <w:spacing w:val="0"/>
+                    <w:w w:val="100"/>
+                    <w:sz w:val="16"/>
+                    <w:szCs w:val="16"/>
+                    <w:lang w:val="ro-RO"/>
+                  </w:rPr>
+                  <w:t xml:space="preserve">                                                        </w:t>
+                </w:r>
+                <w:r>
+                  <w:rPr>
+                    <w:rFonts w:eastAsia="Arial" w:cs="Arial" w:ascii="Arial" w:hAnsi="Arial"/>
+                    <w:b w:val="false"/>
+                    <w:i w:val="false"/>
+                    <w:color w:val="auto"/>
+                    <w:spacing w:val="0"/>
+                    <w:w w:val="100"/>
+                    <w:sz w:val="16"/>
+                    <w:szCs w:val="16"/>
+                    <w:lang w:val="ro-RO"/>
+                  </w:rPr>
+                  <w:br/>
+                </w:r>
+                <w:r>
+                  <w:rPr>
+                    <w:rFonts w:eastAsia="Arial" w:cs="Arial" w:ascii="Arial" w:hAnsi="Arial"/>
+                    <w:b w:val="false"/>
+                    <w:i w:val="false"/>
+                    <w:color w:val="auto"/>
+                    <w:spacing w:val="0"/>
+                    <w:w w:val="100"/>
+                    <w:sz w:val="16"/>
+                    <w:szCs w:val="16"/>
+                    <w:lang w:val="ro-RO"/>
+                  </w:rPr>
+                  <w:t xml:space="preserve">                                                        </w:t>
+                </w:r>
+              </w:sdtContent>
+            </w:sdt>
+          </w:p>
+          <w:p>
+            <w:pPr>
+              <w:pStyle w:val="TableContents"/>
+              <w:keepNext w:val="false"/>
+              <w:bidi w:val="0"/>
+              <w:spacing w:before="80" w:after="0"/>
               <w:ind w:hanging="0" w:left="0"/>
               <w:jc w:val="center"/>
               <w:rPr>
@@ -506,7 +616,117 @@
               <w:pStyle w:val="TableContents"/>
               <w:keepNext w:val="false"/>
               <w:bidi w:val="0"/>
-              <w:spacing w:before="680" w:after="0"/>
+              <w:spacing w:before="0" w:after="0"/>
+              <w:ind w:hanging="0" w:left="0"/>
+              <w:jc w:val="center"/>
+              <w:rPr>
+                <w:rFonts w:ascii="Arial" w:hAnsi="Arial" w:eastAsia="Arial" w:cs="Arial"/>
+                <w:b w:val="false"/>
+                <w:i w:val="false"/>
+                <w:color w:val="auto"/>
+                <w:sz w:val="20"/>
+                <w:lang w:val="ro-RO"/>
+              </w:rPr>
+            </w:pPr>
+            <w:sdt>
+              <w:sdtPr>
+                <w:rPr>
+                  <w:rFonts w:eastAsia="Arial" w:cs="Arial" w:ascii="Arial" w:hAnsi="Arial"/>
+                  <w:b w:val="false"/>
+                  <w:i w:val="false"/>
+                  <w:color w:val="auto"/>
+                  <w:spacing w:val="0"/>
+                  <w:w w:val="100"/>
+                  <w:sz w:val="16"/>
+                  <w:szCs w:val="16"/>
+                  <w:lang w:val="ro-RO"/>
+                </w:rPr>
+                <w:alias w:val="sig_employee"/>
+                <w:tag w:val="sig_employee"/>
+                <w:id w:val="2"/>
+                <w:showingPlcHdr/>
+                <w:text w:multiLine="1"/>
+              </w:sdtPr>
+              <w:sdtContent>
+                <w:r>
+                  <w:rPr>
+                    <w:rFonts w:eastAsia="Arial" w:cs="Arial" w:ascii="Arial" w:hAnsi="Arial"/>
+                    <w:b w:val="false"/>
+                    <w:i w:val="false"/>
+                    <w:color w:val="auto"/>
+                    <w:spacing w:val="0"/>
+                    <w:w w:val="100"/>
+                    <w:sz w:val="16"/>
+                    <w:szCs w:val="16"/>
+                    <w:lang w:val="ro-RO"/>
+                  </w:rPr>
+                  <w:t xml:space="preserve">                                                        </w:t>
+                </w:r>
+                <w:r>
+                  <w:rPr>
+                    <w:rFonts w:eastAsia="Arial" w:cs="Arial" w:ascii="Arial" w:hAnsi="Arial"/>
+                    <w:b w:val="false"/>
+                    <w:i w:val="false"/>
+                    <w:color w:val="auto"/>
+                    <w:spacing w:val="0"/>
+                    <w:w w:val="100"/>
+                    <w:sz w:val="16"/>
+                    <w:szCs w:val="16"/>
+                    <w:lang w:val="ro-RO"/>
+                  </w:rPr>
+                  <w:br/>
+                </w:r>
+                <w:r>
+                  <w:rPr>
+                    <w:rFonts w:eastAsia="Arial" w:cs="Arial" w:ascii="Arial" w:hAnsi="Arial"/>
+                    <w:b w:val="false"/>
+                    <w:i w:val="false"/>
+                    <w:color w:val="auto"/>
+                    <w:spacing w:val="0"/>
+                    <w:w w:val="100"/>
+                    <w:sz w:val="16"/>
+                    <w:szCs w:val="16"/>
+                    <w:lang w:val="ro-RO"/>
+                  </w:rPr>
+                  <w:t xml:space="preserve">                                                        </w:t>
+                </w:r>
+                <w:r>
+                  <w:rPr>
+                    <w:rFonts w:eastAsia="Arial" w:cs="Arial" w:ascii="Arial" w:hAnsi="Arial"/>
+                    <w:b w:val="false"/>
+                    <w:i w:val="false"/>
+                    <w:color w:val="auto"/>
+                    <w:spacing w:val="0"/>
+                    <w:w w:val="100"/>
+                    <w:sz w:val="16"/>
+                    <w:szCs w:val="16"/>
+                    <w:lang w:val="ro-RO"/>
+                  </w:rPr>
+                  <w:br/>
+                </w:r>
+                <w:r>
+                  <w:rPr>
+                    <w:rFonts w:eastAsia="Arial" w:cs="Arial" w:ascii="Arial" w:hAnsi="Arial"/>
+                    <w:b w:val="false"/>
+                    <w:i w:val="false"/>
+                    <w:color w:val="auto"/>
+                    <w:spacing w:val="0"/>
+                    <w:w w:val="100"/>
+                    <w:sz w:val="16"/>
+                    <w:szCs w:val="16"/>
+                    <w:lang w:val="ro-RO"/>
+                  </w:rPr>
+                  <w:t xml:space="preserve">                                                        </w:t>
+                </w:r>
+              </w:sdtContent>
+            </w:sdt>
+          </w:p>
+          <w:p>
+            <w:pPr>
+              <w:pStyle w:val="TableContents"/>
+              <w:keepNext w:val="false"/>
+              <w:bidi w:val="0"/>
+              <w:spacing w:before="80" w:after="0"/>
               <w:ind w:hanging="0" w:left="0"/>
               <w:jc w:val="center"/>
               <w:rPr>

</xml_diff>

<commit_message>
fix(templates,pdf,api): the agreement and the sheets read better signed: bold party names, aligned signature blocks with the representative's name and dates filled at signing, taller signature boxes each with its own line, a larger three-line appearance
</commit_message>
<xml_diff>
--- a/packages/document-engine/templates/act_aditional_semnare_electronica.docx
+++ b/packages/document-engine/templates/act_aditional_semnare_electronica.docx
@@ -94,7 +94,7 @@
         <w:pStyle w:val="Normal"/>
         <w:keepNext w:val="false"/>
         <w:bidi w:val="0"/>
-        <w:spacing w:before="0" w:after="240"/>
+        <w:spacing w:before="0" w:after="400"/>
         <w:ind w:hanging="0" w:left="0"/>
         <w:jc w:val="center"/>
         <w:rPr>
@@ -142,13 +142,46 @@
       <w:r>
         <w:rPr>
           <w:rFonts w:eastAsia="Arial" w:cs="Arial" w:ascii="Arial" w:hAnsi="Arial"/>
-          <w:b w:val="false"/>
-          <w:i w:val="false"/>
-          <w:color w:val="auto"/>
-          <w:sz w:val="20"/>
-          <w:lang w:val="ro-RO"/>
-        </w:rPr>
-        <w:t>{{client.legalName}}, cu sediul în {{client.address}}, cod de înregistrare fiscală {{client.cui}}, reprezentată prin {{client.representativeName}}, în calitate de {{client.representativeRole}}, denumită în continuare „angajator”,</w:t>
+          <w:b/>
+          <w:i w:val="false"/>
+          <w:color w:val="auto"/>
+          <w:sz w:val="20"/>
+          <w:lang w:val="ro-RO"/>
+        </w:rPr>
+        <w:t>{{client.legalName}}</w:t>
+      </w:r>
+      <w:r>
+        <w:rPr>
+          <w:rFonts w:eastAsia="Arial" w:cs="Arial" w:ascii="Arial" w:hAnsi="Arial"/>
+          <w:b w:val="false"/>
+          <w:i w:val="false"/>
+          <w:color w:val="auto"/>
+          <w:sz w:val="20"/>
+          <w:lang w:val="ro-RO"/>
+        </w:rPr>
+        <w:t xml:space="preserve">, cu sediul în {{client.address}}, cod de înregistrare fiscală {{client.cui}}, reprezentată prin </w:t>
+      </w:r>
+      <w:r>
+        <w:rPr>
+          <w:rFonts w:eastAsia="Arial" w:cs="Arial" w:ascii="Arial" w:hAnsi="Arial"/>
+          <w:b/>
+          <w:i w:val="false"/>
+          <w:color w:val="auto"/>
+          <w:sz w:val="20"/>
+          <w:lang w:val="ro-RO"/>
+        </w:rPr>
+        <w:t>{{client.representativeName}}</w:t>
+      </w:r>
+      <w:r>
+        <w:rPr>
+          <w:rFonts w:eastAsia="Arial" w:cs="Arial" w:ascii="Arial" w:hAnsi="Arial"/>
+          <w:b w:val="false"/>
+          <w:i w:val="false"/>
+          <w:color w:val="auto"/>
+          <w:sz w:val="20"/>
+          <w:lang w:val="ro-RO"/>
+        </w:rPr>
+        <w:t>, în calitate de {{client.representativeRole}}, denumită în continuare „angajator”,</w:t>
       </w:r>
     </w:p>
     <w:p>
@@ -208,13 +241,24 @@
       <w:r>
         <w:rPr>
           <w:rFonts w:eastAsia="Arial" w:cs="Arial" w:ascii="Arial" w:hAnsi="Arial"/>
-          <w:b w:val="false"/>
-          <w:i w:val="false"/>
-          <w:color w:val="auto"/>
-          <w:sz w:val="20"/>
-          <w:lang w:val="ro-RO"/>
-        </w:rPr>
-        <w:t>{{employee.name}}, salariat în funcția de {{employee.position}}{{#employee.identification}}, {{employee.identification}}{{/employee.identification}}, cu contract individual de muncă nr. ______ din data de {{employee.hiredOn}}, denumit în continuare „salariat”,</w:t>
+          <w:b/>
+          <w:i w:val="false"/>
+          <w:color w:val="auto"/>
+          <w:sz w:val="20"/>
+          <w:lang w:val="ro-RO"/>
+        </w:rPr>
+        <w:t>{{employee.name}}</w:t>
+      </w:r>
+      <w:r>
+        <w:rPr>
+          <w:rFonts w:eastAsia="Arial" w:cs="Arial" w:ascii="Arial" w:hAnsi="Arial"/>
+          <w:b w:val="false"/>
+          <w:i w:val="false"/>
+          <w:color w:val="auto"/>
+          <w:sz w:val="20"/>
+          <w:lang w:val="ro-RO"/>
+        </w:rPr>
+        <w:t>, salariat în funcția de {{employee.position}}{{#employee.identification}}, {{employee.identification}}{{/employee.identification}}, cu contract individual de muncă nr. {{#employee.contractNumber}}{{employee.contractNumber}}{{/employee.contractNumber}}{{^employee.contractNumber}}______{{/employee.contractNumber}} din data de {{employee.hiredOn}}, denumit în continuare „salariat”,</w:t>
       </w:r>
     </w:p>
     <w:p>
@@ -400,9 +444,7 @@
         <w:gridCol w:w="4678"/>
       </w:tblGrid>
       <w:tr>
-        <w:trPr>
-          <w:cantSplit/>
-        </w:trPr>
+        <w:trPr/>
         <w:tc>
           <w:tcPr>
             <w:tcW w:w="4677" w:type="dxa"/>
@@ -410,10 +452,10 @@
           </w:tcPr>
           <w:p>
             <w:pPr>
-              <w:pStyle w:val="TableContents"/>
-              <w:keepNext w:val="false"/>
+              <w:pStyle w:val="TableHeading"/>
+              <w:keepNext w:val="true"/>
               <w:bidi w:val="0"/>
-              <w:spacing w:before="0" w:after="0"/>
+              <w:spacing w:before="0" w:after="120"/>
               <w:ind w:hanging="0" w:left="0"/>
               <w:jc w:val="center"/>
               <w:rPr>
@@ -437,6 +479,222 @@
               <w:t>Pentru angajator, reprezentant legal sau împuternicit:</w:t>
             </w:r>
           </w:p>
+        </w:tc>
+        <w:tc>
+          <w:tcPr>
+            <w:tcW w:w="4678" w:type="dxa"/>
+            <w:tcBorders/>
+          </w:tcPr>
+          <w:p>
+            <w:pPr>
+              <w:pStyle w:val="TableHeading"/>
+              <w:keepNext w:val="false"/>
+              <w:bidi w:val="0"/>
+              <w:spacing w:before="0" w:after="120"/>
+              <w:ind w:hanging="0" w:left="0"/>
+              <w:jc w:val="center"/>
+              <w:rPr>
+                <w:rFonts w:ascii="Arial" w:hAnsi="Arial" w:eastAsia="Arial" w:cs="Arial"/>
+                <w:b w:val="false"/>
+                <w:i w:val="false"/>
+                <w:color w:val="auto"/>
+                <w:sz w:val="20"/>
+                <w:lang w:val="ro-RO"/>
+              </w:rPr>
+            </w:pPr>
+            <w:r>
+              <w:rPr>
+                <w:rFonts w:eastAsia="Arial" w:cs="Arial" w:ascii="Arial" w:hAnsi="Arial"/>
+                <w:b w:val="false"/>
+                <w:i w:val="false"/>
+                <w:color w:val="auto"/>
+                <w:sz w:val="20"/>
+                <w:lang w:val="ro-RO"/>
+              </w:rPr>
+              <w:t>Salariat:</w:t>
+            </w:r>
+          </w:p>
+        </w:tc>
+      </w:tr>
+      <w:tr>
+        <w:trPr/>
+        <w:tc>
+          <w:tcPr>
+            <w:tcW w:w="4677" w:type="dxa"/>
+            <w:tcBorders/>
+          </w:tcPr>
+          <w:p>
+            <w:pPr>
+              <w:pStyle w:val="TableContents"/>
+              <w:keepNext w:val="true"/>
+              <w:bidi w:val="0"/>
+              <w:spacing w:before="0" w:after="0"/>
+              <w:ind w:hanging="0" w:left="0"/>
+              <w:jc w:val="center"/>
+              <w:rPr>
+                <w:rFonts w:ascii="Arial" w:hAnsi="Arial" w:eastAsia="Arial" w:cs="Arial"/>
+                <w:b w:val="false"/>
+                <w:i w:val="false"/>
+                <w:color w:val="auto"/>
+                <w:sz w:val="20"/>
+                <w:lang w:val="ro-RO"/>
+              </w:rPr>
+            </w:pPr>
+            <w:sdt>
+              <w:sdtPr>
+                <w:rPr>
+                  <w:rFonts w:eastAsia="Arial" w:cs="Arial" w:ascii="Arial" w:hAnsi="Arial"/>
+                  <w:b w:val="false"/>
+                  <w:i w:val="false"/>
+                  <w:color w:val="auto"/>
+                  <w:spacing w:val="0"/>
+                  <w:w w:val="100"/>
+                  <w:sz w:val="20"/>
+                  <w:szCs w:val="20"/>
+                  <w:lang w:val="ro-RO"/>
+                </w:rPr>
+                <w:alias w:val="sig_employer"/>
+                <w:tag w:val="sig_employer"/>
+                <w:id w:val="1"/>
+                <w:showingPlcHdr/>
+                <w:text w:multiLine="1"/>
+              </w:sdtPr>
+              <w:sdtContent>
+                <w:r>
+                  <w:rPr>
+                    <w:rFonts w:eastAsia="Arial" w:cs="Arial" w:ascii="Arial" w:hAnsi="Arial"/>
+                    <w:b w:val="false"/>
+                    <w:i w:val="false"/>
+                    <w:color w:val="auto"/>
+                    <w:spacing w:val="0"/>
+                    <w:w w:val="100"/>
+                    <w:sz w:val="20"/>
+                    <w:szCs w:val="20"/>
+                    <w:lang w:val="ro-RO"/>
+                  </w:rPr>
+                  <w:t xml:space="preserve">                                             </w:t>
+                </w:r>
+                <w:r>
+                  <w:rPr>
+                    <w:rFonts w:eastAsia="Arial" w:cs="Arial" w:ascii="Arial" w:hAnsi="Arial"/>
+                    <w:b w:val="false"/>
+                    <w:i w:val="false"/>
+                    <w:color w:val="auto"/>
+                    <w:spacing w:val="0"/>
+                    <w:w w:val="100"/>
+                    <w:sz w:val="20"/>
+                    <w:szCs w:val="20"/>
+                    <w:lang w:val="ro-RO"/>
+                  </w:rPr>
+                  <w:br/>
+                </w:r>
+                <w:r>
+                  <w:rPr>
+                    <w:rFonts w:eastAsia="Arial" w:cs="Arial" w:ascii="Arial" w:hAnsi="Arial"/>
+                    <w:b w:val="false"/>
+                    <w:i w:val="false"/>
+                    <w:color w:val="auto"/>
+                    <w:spacing w:val="0"/>
+                    <w:w w:val="100"/>
+                    <w:sz w:val="20"/>
+                    <w:szCs w:val="20"/>
+                    <w:lang w:val="ro-RO"/>
+                  </w:rPr>
+                  <w:t xml:space="preserve">                                             </w:t>
+                </w:r>
+                <w:r>
+                  <w:rPr>
+                    <w:rFonts w:eastAsia="Arial" w:cs="Arial" w:ascii="Arial" w:hAnsi="Arial"/>
+                    <w:b w:val="false"/>
+                    <w:i w:val="false"/>
+                    <w:color w:val="auto"/>
+                    <w:spacing w:val="0"/>
+                    <w:w w:val="100"/>
+                    <w:sz w:val="20"/>
+                    <w:szCs w:val="20"/>
+                    <w:lang w:val="ro-RO"/>
+                  </w:rPr>
+                  <w:br/>
+                </w:r>
+                <w:r>
+                  <w:rPr>
+                    <w:rFonts w:eastAsia="Arial" w:cs="Arial" w:ascii="Arial" w:hAnsi="Arial"/>
+                    <w:b w:val="false"/>
+                    <w:i w:val="false"/>
+                    <w:color w:val="auto"/>
+                    <w:spacing w:val="0"/>
+                    <w:w w:val="100"/>
+                    <w:sz w:val="20"/>
+                    <w:szCs w:val="20"/>
+                    <w:lang w:val="ro-RO"/>
+                  </w:rPr>
+                  <w:t xml:space="preserve">                                             </w:t>
+                </w:r>
+                <w:r>
+                  <w:rPr>
+                    <w:rFonts w:eastAsia="Arial" w:cs="Arial" w:ascii="Arial" w:hAnsi="Arial"/>
+                    <w:b w:val="false"/>
+                    <w:i w:val="false"/>
+                    <w:color w:val="auto"/>
+                    <w:spacing w:val="0"/>
+                    <w:w w:val="100"/>
+                    <w:sz w:val="20"/>
+                    <w:szCs w:val="20"/>
+                    <w:lang w:val="ro-RO"/>
+                  </w:rPr>
+                  <w:br/>
+                </w:r>
+                <w:r>
+                  <w:rPr>
+                    <w:rFonts w:eastAsia="Arial" w:cs="Arial" w:ascii="Arial" w:hAnsi="Arial"/>
+                    <w:b w:val="false"/>
+                    <w:i w:val="false"/>
+                    <w:color w:val="auto"/>
+                    <w:spacing w:val="0"/>
+                    <w:w w:val="100"/>
+                    <w:sz w:val="20"/>
+                    <w:szCs w:val="20"/>
+                    <w:lang w:val="ro-RO"/>
+                  </w:rPr>
+                  <w:t xml:space="preserve">                                             </w:t>
+                </w:r>
+                <w:r>
+                  <w:rPr>
+                    <w:rFonts w:eastAsia="Arial" w:cs="Arial" w:ascii="Arial" w:hAnsi="Arial"/>
+                    <w:b w:val="false"/>
+                    <w:i w:val="false"/>
+                    <w:color w:val="auto"/>
+                    <w:spacing w:val="0"/>
+                    <w:w w:val="100"/>
+                    <w:sz w:val="20"/>
+                    <w:szCs w:val="20"/>
+                    <w:lang w:val="ro-RO"/>
+                  </w:rPr>
+                  <w:br/>
+                </w:r>
+                <w:r>
+                  <w:rPr>
+                    <w:rFonts w:eastAsia="Arial" w:cs="Arial" w:ascii="Arial" w:hAnsi="Arial"/>
+                    <w:b w:val="false"/>
+                    <w:i w:val="false"/>
+                    <w:color w:val="auto"/>
+                    <w:spacing w:val="0"/>
+                    <w:w w:val="100"/>
+                    <w:sz w:val="20"/>
+                    <w:szCs w:val="20"/>
+                    <w:lang w:val="ro-RO"/>
+                  </w:rPr>
+                  <w:t xml:space="preserve">                                             </w:t>
+                </w:r>
+              </w:sdtContent>
+            </w:sdt>
+          </w:p>
+        </w:tc>
+        <w:tc>
+          <w:tcPr>
+            <w:tcW w:w="4678" w:type="dxa"/>
+            <w:tcBorders/>
+          </w:tcPr>
           <w:p>
             <w:pPr>
               <w:pStyle w:val="TableContents"/>
@@ -463,13 +721,13 @@
                   <w:color w:val="auto"/>
                   <w:spacing w:val="0"/>
                   <w:w w:val="100"/>
-                  <w:sz w:val="16"/>
-                  <w:szCs w:val="16"/>
+                  <w:sz w:val="20"/>
+                  <w:szCs w:val="20"/>
                   <w:lang w:val="ro-RO"/>
                 </w:rPr>
-                <w:alias w:val="sig_employer"/>
-                <w:tag w:val="sig_employer"/>
-                <w:id w:val="1"/>
+                <w:alias w:val="sig_employee"/>
+                <w:tag w:val="sig_employee"/>
+                <w:id w:val="2"/>
                 <w:showingPlcHdr/>
                 <w:text w:multiLine="1"/>
               </w:sdtPr>
@@ -482,22 +740,22 @@
                     <w:color w:val="auto"/>
                     <w:spacing w:val="0"/>
                     <w:w w:val="100"/>
-                    <w:sz w:val="16"/>
-                    <w:szCs w:val="16"/>
-                    <w:lang w:val="ro-RO"/>
-                  </w:rPr>
-                  <w:t xml:space="preserve">                                                        </w:t>
-                </w:r>
-                <w:r>
-                  <w:rPr>
-                    <w:rFonts w:eastAsia="Arial" w:cs="Arial" w:ascii="Arial" w:hAnsi="Arial"/>
-                    <w:b w:val="false"/>
-                    <w:i w:val="false"/>
-                    <w:color w:val="auto"/>
-                    <w:spacing w:val="0"/>
-                    <w:w w:val="100"/>
-                    <w:sz w:val="16"/>
-                    <w:szCs w:val="16"/>
+                    <w:sz w:val="20"/>
+                    <w:szCs w:val="20"/>
+                    <w:lang w:val="ro-RO"/>
+                  </w:rPr>
+                  <w:t xml:space="preserve">                                             </w:t>
+                </w:r>
+                <w:r>
+                  <w:rPr>
+                    <w:rFonts w:eastAsia="Arial" w:cs="Arial" w:ascii="Arial" w:hAnsi="Arial"/>
+                    <w:b w:val="false"/>
+                    <w:i w:val="false"/>
+                    <w:color w:val="auto"/>
+                    <w:spacing w:val="0"/>
+                    <w:w w:val="100"/>
+                    <w:sz w:val="20"/>
+                    <w:szCs w:val="20"/>
                     <w:lang w:val="ro-RO"/>
                   </w:rPr>
                   <w:br/>
@@ -510,22 +768,22 @@
                     <w:color w:val="auto"/>
                     <w:spacing w:val="0"/>
                     <w:w w:val="100"/>
-                    <w:sz w:val="16"/>
-                    <w:szCs w:val="16"/>
-                    <w:lang w:val="ro-RO"/>
-                  </w:rPr>
-                  <w:t xml:space="preserve">                                                        </w:t>
-                </w:r>
-                <w:r>
-                  <w:rPr>
-                    <w:rFonts w:eastAsia="Arial" w:cs="Arial" w:ascii="Arial" w:hAnsi="Arial"/>
-                    <w:b w:val="false"/>
-                    <w:i w:val="false"/>
-                    <w:color w:val="auto"/>
-                    <w:spacing w:val="0"/>
-                    <w:w w:val="100"/>
-                    <w:sz w:val="16"/>
-                    <w:szCs w:val="16"/>
+                    <w:sz w:val="20"/>
+                    <w:szCs w:val="20"/>
+                    <w:lang w:val="ro-RO"/>
+                  </w:rPr>
+                  <w:t xml:space="preserve">                                             </w:t>
+                </w:r>
+                <w:r>
+                  <w:rPr>
+                    <w:rFonts w:eastAsia="Arial" w:cs="Arial" w:ascii="Arial" w:hAnsi="Arial"/>
+                    <w:b w:val="false"/>
+                    <w:i w:val="false"/>
+                    <w:color w:val="auto"/>
+                    <w:spacing w:val="0"/>
+                    <w:w w:val="100"/>
+                    <w:sz w:val="20"/>
+                    <w:szCs w:val="20"/>
                     <w:lang w:val="ro-RO"/>
                   </w:rPr>
                   <w:br/>
@@ -538,21 +796,86 @@
                     <w:color w:val="auto"/>
                     <w:spacing w:val="0"/>
                     <w:w w:val="100"/>
-                    <w:sz w:val="16"/>
-                    <w:szCs w:val="16"/>
-                    <w:lang w:val="ro-RO"/>
-                  </w:rPr>
-                  <w:t xml:space="preserve">                                                        </w:t>
+                    <w:sz w:val="20"/>
+                    <w:szCs w:val="20"/>
+                    <w:lang w:val="ro-RO"/>
+                  </w:rPr>
+                  <w:t xml:space="preserve">                                             </w:t>
+                </w:r>
+                <w:r>
+                  <w:rPr>
+                    <w:rFonts w:eastAsia="Arial" w:cs="Arial" w:ascii="Arial" w:hAnsi="Arial"/>
+                    <w:b w:val="false"/>
+                    <w:i w:val="false"/>
+                    <w:color w:val="auto"/>
+                    <w:spacing w:val="0"/>
+                    <w:w w:val="100"/>
+                    <w:sz w:val="20"/>
+                    <w:szCs w:val="20"/>
+                    <w:lang w:val="ro-RO"/>
+                  </w:rPr>
+                  <w:br/>
+                </w:r>
+                <w:r>
+                  <w:rPr>
+                    <w:rFonts w:eastAsia="Arial" w:cs="Arial" w:ascii="Arial" w:hAnsi="Arial"/>
+                    <w:b w:val="false"/>
+                    <w:i w:val="false"/>
+                    <w:color w:val="auto"/>
+                    <w:spacing w:val="0"/>
+                    <w:w w:val="100"/>
+                    <w:sz w:val="20"/>
+                    <w:szCs w:val="20"/>
+                    <w:lang w:val="ro-RO"/>
+                  </w:rPr>
+                  <w:t xml:space="preserve">                                             </w:t>
+                </w:r>
+                <w:r>
+                  <w:rPr>
+                    <w:rFonts w:eastAsia="Arial" w:cs="Arial" w:ascii="Arial" w:hAnsi="Arial"/>
+                    <w:b w:val="false"/>
+                    <w:i w:val="false"/>
+                    <w:color w:val="auto"/>
+                    <w:spacing w:val="0"/>
+                    <w:w w:val="100"/>
+                    <w:sz w:val="20"/>
+                    <w:szCs w:val="20"/>
+                    <w:lang w:val="ro-RO"/>
+                  </w:rPr>
+                  <w:br/>
+                </w:r>
+                <w:r>
+                  <w:rPr>
+                    <w:rFonts w:eastAsia="Arial" w:cs="Arial" w:ascii="Arial" w:hAnsi="Arial"/>
+                    <w:b w:val="false"/>
+                    <w:i w:val="false"/>
+                    <w:color w:val="auto"/>
+                    <w:spacing w:val="0"/>
+                    <w:w w:val="100"/>
+                    <w:sz w:val="20"/>
+                    <w:szCs w:val="20"/>
+                    <w:lang w:val="ro-RO"/>
+                  </w:rPr>
+                  <w:t xml:space="preserve">                                             </w:t>
                 </w:r>
               </w:sdtContent>
             </w:sdt>
           </w:p>
+        </w:tc>
+      </w:tr>
+      <w:tr>
+        <w:trPr/>
+        <w:tc>
+          <w:tcPr>
+            <w:tcW w:w="4677" w:type="dxa"/>
+            <w:tcBorders/>
+          </w:tcPr>
           <w:p>
             <w:pPr>
               <w:pStyle w:val="TableContents"/>
-              <w:keepNext w:val="false"/>
+              <w:keepNext w:val="true"/>
               <w:bidi w:val="0"/>
-              <w:spacing w:before="80" w:after="0"/>
+              <w:spacing w:before="0" w:after="0"/>
               <w:ind w:hanging="0" w:left="0"/>
               <w:jc w:val="center"/>
               <w:rPr>
@@ -573,13 +896,57 @@
                 <w:sz w:val="20"/>
                 <w:lang w:val="ro-RO"/>
               </w:rPr>
-              <w:t>Nume: ______________________________</w:t>
+              <w:t>{{client.representativeName}}</w:t>
             </w:r>
           </w:p>
+        </w:tc>
+        <w:tc>
+          <w:tcPr>
+            <w:tcW w:w="4678" w:type="dxa"/>
+            <w:tcBorders/>
+          </w:tcPr>
           <w:p>
             <w:pPr>
               <w:pStyle w:val="TableContents"/>
               <w:keepNext w:val="false"/>
+              <w:bidi w:val="0"/>
+              <w:spacing w:before="0" w:after="0"/>
+              <w:ind w:hanging="0" w:left="0"/>
+              <w:jc w:val="center"/>
+              <w:rPr>
+                <w:rFonts w:ascii="Arial" w:hAnsi="Arial" w:eastAsia="Arial" w:cs="Arial"/>
+                <w:b/>
+                <w:i w:val="false"/>
+                <w:color w:val="auto"/>
+                <w:sz w:val="20"/>
+                <w:lang w:val="ro-RO"/>
+              </w:rPr>
+            </w:pPr>
+            <w:r>
+              <w:rPr>
+                <w:rFonts w:eastAsia="Arial" w:cs="Arial" w:ascii="Arial" w:hAnsi="Arial"/>
+                <w:b/>
+                <w:i w:val="false"/>
+                <w:color w:val="auto"/>
+                <w:sz w:val="20"/>
+                <w:lang w:val="ro-RO"/>
+              </w:rPr>
+              <w:t>{{employee.name}}</w:t>
+            </w:r>
+          </w:p>
+        </w:tc>
+      </w:tr>
+      <w:tr>
+        <w:trPr/>
+        <w:tc>
+          <w:tcPr>
+            <w:tcW w:w="4677" w:type="dxa"/>
+            <w:tcBorders/>
+          </w:tcPr>
+          <w:p>
+            <w:pPr>
+              <w:pStyle w:val="TableContents"/>
+              <w:keepNext w:val="true"/>
               <w:bidi w:val="0"/>
               <w:spacing w:before="0" w:after="0"/>
               <w:ind w:hanging="0" w:left="0"/>
@@ -602,36 +969,7 @@
                 <w:sz w:val="20"/>
                 <w:lang w:val="ro-RO"/>
               </w:rPr>
-              <w:t>{{client.legalName}}</w:t>
-            </w:r>
-          </w:p>
-          <w:p>
-            <w:pPr>
-              <w:pStyle w:val="TableContents"/>
-              <w:keepNext w:val="false"/>
-              <w:bidi w:val="0"/>
-              <w:spacing w:before="120" w:after="0"/>
-              <w:ind w:hanging="0" w:left="0"/>
-              <w:jc w:val="center"/>
-              <w:rPr>
-                <w:rFonts w:ascii="Arial" w:hAnsi="Arial" w:eastAsia="Arial" w:cs="Arial"/>
-                <w:b w:val="false"/>
-                <w:i w:val="false"/>
-                <w:color w:val="auto"/>
-                <w:sz w:val="20"/>
-                <w:lang w:val="ro-RO"/>
-              </w:rPr>
-            </w:pPr>
-            <w:r>
-              <w:rPr>
-                <w:rFonts w:eastAsia="Arial" w:cs="Arial" w:ascii="Arial" w:hAnsi="Arial"/>
-                <w:b w:val="false"/>
-                <w:i w:val="false"/>
-                <w:color w:val="auto"/>
-                <w:sz w:val="20"/>
-                <w:lang w:val="ro-RO"/>
-              </w:rPr>
-              <w:t>Data: ____________________</w:t>
+              <w:t>{{client.representativeRole}}, {{client.legalName}}</w:t>
             </w:r>
           </w:p>
         </w:tc>
@@ -666,148 +1004,18 @@
                 <w:sz w:val="20"/>
                 <w:lang w:val="ro-RO"/>
               </w:rPr>
-              <w:t>Salariat</w:t>
+              <w:t>{{employee.position}}</w:t>
             </w:r>
           </w:p>
-          <w:p>
-            <w:pPr>
-              <w:pStyle w:val="TableContents"/>
-              <w:keepNext w:val="false"/>
-              <w:bidi w:val="0"/>
-              <w:spacing w:before="0" w:after="0"/>
-              <w:ind w:hanging="0" w:left="0"/>
-              <w:jc w:val="center"/>
-              <w:rPr>
-                <w:rFonts w:ascii="Arial" w:hAnsi="Arial" w:eastAsia="Arial" w:cs="Arial"/>
-                <w:b w:val="false"/>
-                <w:i w:val="false"/>
-                <w:color w:val="auto"/>
-                <w:sz w:val="20"/>
-                <w:lang w:val="ro-RO"/>
-              </w:rPr>
-            </w:pPr>
-            <w:sdt>
-              <w:sdtPr>
-                <w:rPr>
-                  <w:rFonts w:eastAsia="Arial" w:cs="Arial" w:ascii="Arial" w:hAnsi="Arial"/>
-                  <w:b w:val="false"/>
-                  <w:i w:val="false"/>
-                  <w:color w:val="auto"/>
-                  <w:spacing w:val="0"/>
-                  <w:w w:val="100"/>
-                  <w:sz w:val="16"/>
-                  <w:szCs w:val="16"/>
-                  <w:lang w:val="ro-RO"/>
-                </w:rPr>
-                <w:alias w:val="sig_employee"/>
-                <w:tag w:val="sig_employee"/>
-                <w:id w:val="2"/>
-                <w:showingPlcHdr/>
-                <w:text w:multiLine="1"/>
-              </w:sdtPr>
-              <w:sdtContent>
-                <w:r>
-                  <w:rPr>
-                    <w:rFonts w:eastAsia="Arial" w:cs="Arial" w:ascii="Arial" w:hAnsi="Arial"/>
-                    <w:b w:val="false"/>
-                    <w:i w:val="false"/>
-                    <w:color w:val="auto"/>
-                    <w:spacing w:val="0"/>
-                    <w:w w:val="100"/>
-                    <w:sz w:val="16"/>
-                    <w:szCs w:val="16"/>
-                    <w:lang w:val="ro-RO"/>
-                  </w:rPr>
-                  <w:t xml:space="preserve">                                                        </w:t>
-                </w:r>
-                <w:r>
-                  <w:rPr>
-                    <w:rFonts w:eastAsia="Arial" w:cs="Arial" w:ascii="Arial" w:hAnsi="Arial"/>
-                    <w:b w:val="false"/>
-                    <w:i w:val="false"/>
-                    <w:color w:val="auto"/>
-                    <w:spacing w:val="0"/>
-                    <w:w w:val="100"/>
-                    <w:sz w:val="16"/>
-                    <w:szCs w:val="16"/>
-                    <w:lang w:val="ro-RO"/>
-                  </w:rPr>
-                  <w:br/>
-                </w:r>
-                <w:r>
-                  <w:rPr>
-                    <w:rFonts w:eastAsia="Arial" w:cs="Arial" w:ascii="Arial" w:hAnsi="Arial"/>
-                    <w:b w:val="false"/>
-                    <w:i w:val="false"/>
-                    <w:color w:val="auto"/>
-                    <w:spacing w:val="0"/>
-                    <w:w w:val="100"/>
-                    <w:sz w:val="16"/>
-                    <w:szCs w:val="16"/>
-                    <w:lang w:val="ro-RO"/>
-                  </w:rPr>
-                  <w:t xml:space="preserve">                                                        </w:t>
-                </w:r>
-                <w:r>
-                  <w:rPr>
-                    <w:rFonts w:eastAsia="Arial" w:cs="Arial" w:ascii="Arial" w:hAnsi="Arial"/>
-                    <w:b w:val="false"/>
-                    <w:i w:val="false"/>
-                    <w:color w:val="auto"/>
-                    <w:spacing w:val="0"/>
-                    <w:w w:val="100"/>
-                    <w:sz w:val="16"/>
-                    <w:szCs w:val="16"/>
-                    <w:lang w:val="ro-RO"/>
-                  </w:rPr>
-                  <w:br/>
-                </w:r>
-                <w:r>
-                  <w:rPr>
-                    <w:rFonts w:eastAsia="Arial" w:cs="Arial" w:ascii="Arial" w:hAnsi="Arial"/>
-                    <w:b w:val="false"/>
-                    <w:i w:val="false"/>
-                    <w:color w:val="auto"/>
-                    <w:spacing w:val="0"/>
-                    <w:w w:val="100"/>
-                    <w:sz w:val="16"/>
-                    <w:szCs w:val="16"/>
-                    <w:lang w:val="ro-RO"/>
-                  </w:rPr>
-                  <w:t xml:space="preserve">                                                        </w:t>
-                </w:r>
-              </w:sdtContent>
-            </w:sdt>
-          </w:p>
-          <w:p>
-            <w:pPr>
-              <w:pStyle w:val="TableContents"/>
-              <w:keepNext w:val="false"/>
-              <w:bidi w:val="0"/>
-              <w:spacing w:before="80" w:after="0"/>
-              <w:ind w:hanging="0" w:left="0"/>
-              <w:jc w:val="center"/>
-              <w:rPr>
-                <w:rFonts w:ascii="Arial" w:hAnsi="Arial" w:eastAsia="Arial" w:cs="Arial"/>
-                <w:b/>
-                <w:i w:val="false"/>
-                <w:color w:val="auto"/>
-                <w:sz w:val="20"/>
-                <w:lang w:val="ro-RO"/>
-              </w:rPr>
-            </w:pPr>
-            <w:r>
-              <w:rPr>
-                <w:rFonts w:eastAsia="Arial" w:cs="Arial" w:ascii="Arial" w:hAnsi="Arial"/>
-                <w:b/>
-                <w:i w:val="false"/>
-                <w:color w:val="auto"/>
-                <w:sz w:val="20"/>
-                <w:lang w:val="ro-RO"/>
-              </w:rPr>
-              <w:t>{{employee.name}}</w:t>
-            </w:r>
-          </w:p>
+        </w:tc>
+      </w:tr>
+      <w:tr>
+        <w:trPr/>
+        <w:tc>
+          <w:tcPr>
+            <w:tcW w:w="4677" w:type="dxa"/>
+            <w:tcBorders/>
+          </w:tcPr>
           <w:p>
             <w:pPr>
               <w:pStyle w:val="TableContents"/>
@@ -831,18 +1039,63 @@
                 <w:b w:val="false"/>
                 <w:i w:val="false"/>
                 <w:color w:val="auto"/>
+                <w:spacing w:val="0"/>
+                <w:w w:val="100"/>
                 <w:sz w:val="20"/>
+                <w:szCs w:val="20"/>
                 <w:lang w:val="ro-RO"/>
               </w:rPr>
-              <w:t>{{employee.position}}</w:t>
+              <w:t xml:space="preserve">Data: </w:t>
             </w:r>
+            <w:sdt>
+              <w:sdtPr>
+                <w:rPr>
+                  <w:rFonts w:eastAsia="Arial" w:cs="Arial" w:ascii="Arial" w:hAnsi="Arial"/>
+                  <w:b w:val="false"/>
+                  <w:i w:val="false"/>
+                  <w:color w:val="auto"/>
+                  <w:spacing w:val="0"/>
+                  <w:w w:val="100"/>
+                  <w:sz w:val="20"/>
+                  <w:szCs w:val="20"/>
+                  <w:lang w:val="ro-RO"/>
+                </w:rPr>
+                <w:alias w:val="date_employer"/>
+                <w:tag w:val="date_employer"/>
+                <w:id w:val="3"/>
+                <w:showingPlcHdr/>
+                <w:text/>
+              </w:sdtPr>
+              <w:sdtContent>
+                <w:r>
+                  <w:rPr>
+                    <w:rFonts w:eastAsia="Arial" w:cs="Arial" w:ascii="Arial" w:hAnsi="Arial"/>
+                    <w:b w:val="false"/>
+                    <w:i w:val="false"/>
+                    <w:color w:val="auto"/>
+                    <w:spacing w:val="0"/>
+                    <w:w w:val="100"/>
+                    <w:sz w:val="20"/>
+                    <w:szCs w:val="20"/>
+                    <w:lang w:val="ro-RO"/>
+                  </w:rPr>
+                  <w:t xml:space="preserve">                     </w:t>
+                </w:r>
+              </w:sdtContent>
+            </w:sdt>
           </w:p>
+        </w:tc>
+        <w:tc>
+          <w:tcPr>
+            <w:tcW w:w="4678" w:type="dxa"/>
+            <w:tcBorders/>
+          </w:tcPr>
           <w:p>
             <w:pPr>
               <w:pStyle w:val="TableContents"/>
               <w:keepNext w:val="false"/>
               <w:bidi w:val="0"/>
-              <w:spacing w:before="120" w:after="0"/>
+              <w:spacing w:before="0" w:after="0"/>
               <w:ind w:hanging="0" w:left="0"/>
               <w:jc w:val="center"/>
               <w:rPr>
@@ -860,11 +1113,50 @@
                 <w:b w:val="false"/>
                 <w:i w:val="false"/>
                 <w:color w:val="auto"/>
+                <w:spacing w:val="0"/>
+                <w:w w:val="100"/>
                 <w:sz w:val="20"/>
+                <w:szCs w:val="20"/>
                 <w:lang w:val="ro-RO"/>
               </w:rPr>
-              <w:t>Data: ____________________</w:t>
+              <w:t xml:space="preserve">Data: </w:t>
             </w:r>
+            <w:sdt>
+              <w:sdtPr>
+                <w:rPr>
+                  <w:rFonts w:eastAsia="Arial" w:cs="Arial" w:ascii="Arial" w:hAnsi="Arial"/>
+                  <w:b w:val="false"/>
+                  <w:i w:val="false"/>
+                  <w:color w:val="auto"/>
+                  <w:spacing w:val="0"/>
+                  <w:w w:val="100"/>
+                  <w:sz w:val="20"/>
+                  <w:szCs w:val="20"/>
+                  <w:lang w:val="ro-RO"/>
+                </w:rPr>
+                <w:alias w:val="date_employee"/>
+                <w:tag w:val="date_employee"/>
+                <w:id w:val="4"/>
+                <w:showingPlcHdr/>
+                <w:text/>
+              </w:sdtPr>
+              <w:sdtContent>
+                <w:r>
+                  <w:rPr>
+                    <w:rFonts w:eastAsia="Arial" w:cs="Arial" w:ascii="Arial" w:hAnsi="Arial"/>
+                    <w:b w:val="false"/>
+                    <w:i w:val="false"/>
+                    <w:color w:val="auto"/>
+                    <w:spacing w:val="0"/>
+                    <w:w w:val="100"/>
+                    <w:sz w:val="20"/>
+                    <w:szCs w:val="20"/>
+                    <w:lang w:val="ro-RO"/>
+                  </w:rPr>
+                  <w:t xml:space="preserve">                     </w:t>
+                </w:r>
+              </w:sdtContent>
+            </w:sdt>
           </w:p>
         </w:tc>
       </w:tr>
@@ -1327,6 +1619,19 @@
     </w:pPr>
     <w:rPr/>
   </w:style>
+  <w:style w:type="paragraph" w:styleId="TableHeading">
+    <w:name w:val="Table Heading"/>
+    <w:basedOn w:val="TableContents"/>
+    <w:qFormat/>
+    <w:pPr>
+      <w:suppressLineNumbers/>
+      <w:jc w:val="center"/>
+    </w:pPr>
+    <w:rPr>
+      <w:b/>
+      <w:bCs/>
+    </w:rPr>
+  </w:style>
   <w:style w:type="numbering" w:styleId="ContractArticles">
     <w:name w:val="ContractArticles"/>
     <w:qFormat/>

</xml_diff>

<commit_message>
fix(pdf,templates): a signature's appearance is centred in its box, a filled field's text sits on its label's line, the agreement's date field is a date wide
</commit_message>
<xml_diff>
--- a/packages/document-engine/templates/act_aditional_semnare_electronica.docx
+++ b/packages/document-engine/templates/act_aditional_semnare_electronica.docx
@@ -1079,7 +1079,7 @@
                     <w:szCs w:val="20"/>
                     <w:lang w:val="ro-RO"/>
                   </w:rPr>
-                  <w:t xml:space="preserve">                     </w:t>
+                  <w:t xml:space="preserve">           </w:t>
                 </w:r>
               </w:sdtContent>
             </w:sdt>
@@ -1153,7 +1153,7 @@
                     <w:szCs w:val="20"/>
                     <w:lang w:val="ro-RO"/>
                   </w:rPr>
-                  <w:t xml:space="preserve">                     </w:t>
+                  <w:t xml:space="preserve">           </w:t>
                 </w:r>
               </w:sdtContent>
             </w:sdt>

</xml_diff>

<commit_message>
fix(templates,api): the agreement's signature block has a row more above it and a tighter heading, with a three-line appearance at the body size
</commit_message>
<xml_diff>
--- a/packages/document-engine/templates/act_aditional_semnare_electronica.docx
+++ b/packages/document-engine/templates/act_aditional_semnare_electronica.docx
@@ -402,7 +402,7 @@
           <w:numId w:val="1"/>
         </w:numPr>
         <w:bidi w:val="0"/>
-        <w:spacing w:before="0" w:after="120"/>
+        <w:spacing w:before="0" w:after="360"/>
         <w:ind w:hanging="0" w:left="0"/>
         <w:jc w:val="left"/>
         <w:rPr>
@@ -455,7 +455,7 @@
               <w:pStyle w:val="TableHeading"/>
               <w:keepNext w:val="true"/>
               <w:bidi w:val="0"/>
-              <w:spacing w:before="0" w:after="120"/>
+              <w:spacing w:before="0" w:after="0"/>
               <w:ind w:hanging="0" w:left="0"/>
               <w:jc w:val="center"/>
               <w:rPr>
@@ -490,7 +490,7 @@
               <w:pStyle w:val="TableHeading"/>
               <w:keepNext w:val="false"/>
               <w:bidi w:val="0"/>
-              <w:spacing w:before="0" w:after="120"/>
+              <w:spacing w:before="0" w:after="0"/>
               <w:ind w:hanging="0" w:left="0"/>
               <w:jc w:val="center"/>
               <w:rPr>
@@ -875,7 +875,7 @@
               <w:pStyle w:val="TableContents"/>
               <w:keepNext w:val="true"/>
               <w:bidi w:val="0"/>
-              <w:spacing w:before="0" w:after="0"/>
+              <w:spacing w:before="120" w:after="0"/>
               <w:ind w:hanging="0" w:left="0"/>
               <w:jc w:val="center"/>
               <w:rPr>
@@ -910,7 +910,7 @@
               <w:pStyle w:val="TableContents"/>
               <w:keepNext w:val="false"/>
               <w:bidi w:val="0"/>
-              <w:spacing w:before="0" w:after="0"/>
+              <w:spacing w:before="120" w:after="0"/>
               <w:ind w:hanging="0" w:left="0"/>
               <w:jc w:val="center"/>
               <w:rPr>
@@ -1164,7 +1164,6 @@
     <w:p>
       <w:pPr>
         <w:pStyle w:val="Normal"/>
-        <w:keepNext w:val="false"/>
         <w:numPr>
           <w:ilvl w:val="0"/>
           <w:numId w:val="0"/>

</xml_diff>